<commit_message>
docs: syntax laporan diganti capture terminal (user + command)
</commit_message>
<xml_diff>
--- a/Laporan UTS Pemrograman 3 - Student Risk Web.docx
+++ b/Laporan UTS Pemrograman 3 - Student Risk Web.docx
@@ -460,7 +460,7 @@
                 <w:rFonts w:ascii="Times New Roman" w:hAnsi="Times New Roman"/>
                 <w:sz w:val="22"/>
               </w:rPr>
-              <w:t>7 commit bertahap (log --oneline)</w:t>
+              <w:t>8 commit bertahap (log --oneline)</w:t>
             </w:r>
           </w:p>
         </w:tc>
@@ -858,12 +858,51 @@
           <w:b w:val="0"/>
           <w:sz w:val="24"/>
         </w:rPr>
-        <w:t>Struktur akhir project:</w:t>
+        <w:t>Struktur akhir project (capture terminal, user herdan@linux):</w:t>
       </w:r>
     </w:p>
     <w:p>
       <w:pPr>
-        <w:jc w:val="left"/>
+        <w:jc w:val="center"/>
+      </w:pPr>
+      <w:r>
+        <w:drawing>
+          <wp:inline xmlns:a="http://schemas.openxmlformats.org/drawingml/2006/main" xmlns:pic="http://schemas.openxmlformats.org/drawingml/2006/picture">
+            <wp:extent cx="5486400" cy="2299637"/>
+            <wp:docPr id="1" name="Picture 1"/>
+            <wp:cNvGraphicFramePr>
+              <a:graphicFrameLocks noChangeAspect="1"/>
+            </wp:cNvGraphicFramePr>
+            <a:graphic>
+              <a:graphicData uri="http://schemas.openxmlformats.org/drawingml/2006/picture">
+                <pic:pic>
+                  <pic:nvPicPr>
+                    <pic:cNvPr id="0" name="terminal_tree.png"/>
+                    <pic:cNvPicPr/>
+                  </pic:nvPicPr>
+                  <pic:blipFill>
+                    <a:blip r:embed="rId9"/>
+                    <a:stretch>
+                      <a:fillRect/>
+                    </a:stretch>
+                  </pic:blipFill>
+                  <pic:spPr>
+                    <a:xfrm>
+                      <a:off x="0" y="0"/>
+                      <a:ext cx="5486400" cy="2299637"/>
+                    </a:xfrm>
+                    <a:prstGeom prst="rect"/>
+                  </pic:spPr>
+                </pic:pic>
+              </a:graphicData>
+            </a:graphic>
+          </wp:inline>
+        </w:drawing>
+      </w:r>
+    </w:p>
+    <w:p>
+      <w:pPr>
+        <w:jc w:val="center"/>
       </w:pPr>
       <w:r>
         <w:rPr>
@@ -872,31 +911,6 @@
           <w:sz w:val="22"/>
         </w:rPr>
         <w:t>Gambar 1.1 Struktur file (find app db -type f).</w:t>
-      </w:r>
-    </w:p>
-    <w:p>
-      <w:pPr>
-        <w:spacing w:after="120"/>
-        <w:shd w:val="clear" w:fill="F2F2F2"/>
-      </w:pPr>
-      <w:r>
-        <w:rPr>
-          <w:rFonts w:ascii="Consolas" w:hAnsi="Consolas"/>
-          <w:sz w:val="20"/>
-        </w:rPr>
-        <w:t>app/app.py, app/db.py</w:t>
-        <w:br/>
-        <w:t>app/models/student.py</w:t>
-        <w:br/>
-        <w:t>app/services/risk_service.py</w:t>
-        <w:br/>
-        <w:t>app/repositories/student_repository.py</w:t>
-        <w:br/>
-        <w:t>app/templates/base.html, index.html, students.html, add_student.html, error.html</w:t>
-        <w:br/>
-        <w:t>app/static/style.css</w:t>
-        <w:br/>
-        <w:t>db/init.sql  |  Dockerfile  |  compose.yaml  |  cek_uts.sh  |  EVIDENCE.md</w:t>
       </w:r>
     </w:p>
     <w:p>
@@ -923,7 +937,60 @@
     </w:p>
     <w:p>
       <w:pPr>
-        <w:jc w:val="left"/>
+        <w:spacing w:after="120"/>
+        <w:jc w:val="both"/>
+      </w:pPr>
+      <w:r>
+        <w:rPr>
+          <w:rFonts w:ascii="Times New Roman" w:hAnsi="Times New Roman"/>
+          <w:b w:val="0"/>
+          <w:sz w:val="24"/>
+        </w:rPr>
+        <w:t>Perintah menjalankan dan memeriksa (capture terminal):</w:t>
+      </w:r>
+    </w:p>
+    <w:p>
+      <w:pPr>
+        <w:jc w:val="center"/>
+      </w:pPr>
+      <w:r>
+        <w:drawing>
+          <wp:inline xmlns:a="http://schemas.openxmlformats.org/drawingml/2006/main" xmlns:pic="http://schemas.openxmlformats.org/drawingml/2006/picture">
+            <wp:extent cx="5303520" cy="2152036"/>
+            <wp:docPr id="2" name="Picture 2"/>
+            <wp:cNvGraphicFramePr>
+              <a:graphicFrameLocks noChangeAspect="1"/>
+            </wp:cNvGraphicFramePr>
+            <a:graphic>
+              <a:graphicData uri="http://schemas.openxmlformats.org/drawingml/2006/picture">
+                <pic:pic>
+                  <pic:nvPicPr>
+                    <pic:cNvPr id="0" name="terminal_docker_ps.png"/>
+                    <pic:cNvPicPr/>
+                  </pic:nvPicPr>
+                  <pic:blipFill>
+                    <a:blip r:embed="rId10"/>
+                    <a:stretch>
+                      <a:fillRect/>
+                    </a:stretch>
+                  </pic:blipFill>
+                  <pic:spPr>
+                    <a:xfrm>
+                      <a:off x="0" y="0"/>
+                      <a:ext cx="5303520" cy="2152036"/>
+                    </a:xfrm>
+                    <a:prstGeom prst="rect"/>
+                  </pic:spPr>
+                </pic:pic>
+              </a:graphicData>
+            </a:graphic>
+          </wp:inline>
+        </w:drawing>
+      </w:r>
+    </w:p>
+    <w:p>
+      <w:pPr>
+        <w:jc w:val="center"/>
       </w:pPr>
       <w:r>
         <w:rPr>
@@ -931,24 +998,7 @@
           <w:i/>
           <w:sz w:val="22"/>
         </w:rPr>
-        <w:t>Perintah menjalankan dan memeriksa.</w:t>
-      </w:r>
-    </w:p>
-    <w:p>
-      <w:pPr>
-        <w:spacing w:after="120"/>
-        <w:shd w:val="clear" w:fill="F2F2F2"/>
-      </w:pPr>
-      <w:r>
-        <w:rPr>
-          <w:rFonts w:ascii="Consolas" w:hAnsi="Consolas"/>
-          <w:sz w:val="20"/>
-        </w:rPr>
-        <w:t>docker compose up -d --build</w:t>
-        <w:br/>
-        <w:t>docker compose ps</w:t>
-        <w:br/>
-        <w:t>curl -s http://localhost:8080/health</w:t>
+        <w:t>Gambar 2.1 docker compose up dan docker compose ps.</w:t>
       </w:r>
     </w:p>
     <w:p>
@@ -967,7 +1017,46 @@
     </w:p>
     <w:p>
       <w:pPr>
-        <w:jc w:val="left"/>
+        <w:jc w:val="center"/>
+      </w:pPr>
+      <w:r>
+        <w:drawing>
+          <wp:inline xmlns:a="http://schemas.openxmlformats.org/drawingml/2006/main" xmlns:pic="http://schemas.openxmlformats.org/drawingml/2006/picture">
+            <wp:extent cx="5486400" cy="1380226"/>
+            <wp:docPr id="3" name="Picture 3"/>
+            <wp:cNvGraphicFramePr>
+              <a:graphicFrameLocks noChangeAspect="1"/>
+            </wp:cNvGraphicFramePr>
+            <a:graphic>
+              <a:graphicData uri="http://schemas.openxmlformats.org/drawingml/2006/picture">
+                <pic:pic>
+                  <pic:nvPicPr>
+                    <pic:cNvPr id="0" name="terminal_health.png"/>
+                    <pic:cNvPicPr/>
+                  </pic:nvPicPr>
+                  <pic:blipFill>
+                    <a:blip r:embed="rId11"/>
+                    <a:stretch>
+                      <a:fillRect/>
+                    </a:stretch>
+                  </pic:blipFill>
+                  <pic:spPr>
+                    <a:xfrm>
+                      <a:off x="0" y="0"/>
+                      <a:ext cx="5486400" cy="1380226"/>
+                    </a:xfrm>
+                    <a:prstGeom prst="rect"/>
+                  </pic:spPr>
+                </pic:pic>
+              </a:graphicData>
+            </a:graphic>
+          </wp:inline>
+        </w:drawing>
+      </w:r>
+    </w:p>
+    <w:p>
+      <w:pPr>
+        <w:jc w:val="center"/>
       </w:pPr>
       <w:r>
         <w:rPr>
@@ -975,27 +1064,7 @@
           <w:i/>
           <w:sz w:val="22"/>
         </w:rPr>
-        <w:t>Gambar 2.1 Output docker compose ps dan /health.</w:t>
-      </w:r>
-    </w:p>
-    <w:p>
-      <w:pPr>
-        <w:spacing w:after="120"/>
-        <w:shd w:val="clear" w:fill="F2F2F2"/>
-      </w:pPr>
-      <w:r>
-        <w:rPr>
-          <w:rFonts w:ascii="Consolas" w:hAnsi="Consolas"/>
-          <w:sz w:val="20"/>
-        </w:rPr>
-        <w:t>NAME               STATUS</w:t>
-        <w:br/>
-        <w:t>student-risk-web   Up (0.0.0.0:8080-&gt;5000/tcp)</w:t>
-        <w:br/>
-        <w:t>student-risk-db    Up (5432/tcp)</w:t>
-        <w:br/>
-        <w:br/>
-        <w:t>{"status":"ok","db":"up"}</w:t>
+        <w:t>Gambar 2.2 Output /health dan cek HTTP semua route.</w:t>
       </w:r>
     </w:p>
     <w:p>
@@ -1233,7 +1302,7 @@
           <w:b w:val="0"/>
           <w:sz w:val="24"/>
         </w:rPr>
-        <w:t>Validasi dilakukan di dua lapis. Di model dan service, input salah menaikkan ValueError (nama kosong, score bukan angka, score di luar 0-100, risk tidak dikenal). Di route /students/add, kegagalan validasi mengembalikan HTTP 400พร้อม flash dan mempertahankan isian form. Filter risk yang tidak dikenal memberi flash warning lalu fallback ke ALL.</w:t>
+        <w:t>Validasi dilakukan di dua lapis. Di model dan service, input salah menaikkan ValueError (nama kosong, score bukan angka, score di luar 0-100, risk tidak dikenal). Di route /students/add, kegagalan validasi mengembalikan HTTP 400 beserta flash dan mempertahankan isian form. Filter risk yang tidak dikenal memberi flash warning lalu fallback ke ALL.</w:t>
       </w:r>
     </w:p>
     <w:p>
@@ -1248,6 +1317,58 @@
           <w:sz w:val="24"/>
         </w:rPr>
         <w:t>Error handling database memakai try/except psycopg2.Error di setiap route yang menyentuh repository; kegagalan dirender ke error.html dengan HTTP 500 dan dicatat via app.logger. Handler 404 dan 500 global juga disediakan. Operasi tulis sepenuhnya via program: repo.add() memakai INSERT ... RETURNING id dan repo.delete() memakai DELETE WHERE id dengan rowcount sebagai bukti hapus. Uji manual: POST name=UTS_Test score=62 menghasilkan MEDIUM_RISK dan menambah total 6-&gt;7; penghapusan mengembalikan total ke 6. Ini memenuhi butir 8 dan 9.</w:t>
+      </w:r>
+    </w:p>
+    <w:p>
+      <w:pPr>
+        <w:jc w:val="center"/>
+      </w:pPr>
+      <w:r>
+        <w:drawing>
+          <wp:inline xmlns:a="http://schemas.openxmlformats.org/drawingml/2006/main" xmlns:pic="http://schemas.openxmlformats.org/drawingml/2006/picture">
+            <wp:extent cx="5486400" cy="1806291"/>
+            <wp:docPr id="4" name="Picture 4"/>
+            <wp:cNvGraphicFramePr>
+              <a:graphicFrameLocks noChangeAspect="1"/>
+            </wp:cNvGraphicFramePr>
+            <a:graphic>
+              <a:graphicData uri="http://schemas.openxmlformats.org/drawingml/2006/picture">
+                <pic:pic>
+                  <pic:nvPicPr>
+                    <pic:cNvPr id="0" name="terminal_crud.png"/>
+                    <pic:cNvPicPr/>
+                  </pic:nvPicPr>
+                  <pic:blipFill>
+                    <a:blip r:embed="rId12"/>
+                    <a:stretch>
+                      <a:fillRect/>
+                    </a:stretch>
+                  </pic:blipFill>
+                  <pic:spPr>
+                    <a:xfrm>
+                      <a:off x="0" y="0"/>
+                      <a:ext cx="5486400" cy="1806291"/>
+                    </a:xfrm>
+                    <a:prstGeom prst="rect"/>
+                  </pic:spPr>
+                </pic:pic>
+              </a:graphicData>
+            </a:graphic>
+          </wp:inline>
+        </w:drawing>
+      </w:r>
+    </w:p>
+    <w:p>
+      <w:pPr>
+        <w:jc w:val="center"/>
+      </w:pPr>
+      <w:r>
+        <w:rPr>
+          <w:rFonts w:ascii="Times New Roman" w:hAnsi="Times New Roman"/>
+          <w:i/>
+          <w:sz w:val="22"/>
+        </w:rPr>
+        <w:t>Gambar 5.1 Uji tambah dan hapus student via program (capture terminal).</w:t>
       </w:r>
     </w:p>
     <w:p>
@@ -1283,12 +1404,51 @@
           <w:b w:val="0"/>
           <w:sz w:val="24"/>
         </w:rPr>
-        <w:t>Fitur analisis baru di atas prediksi: summary() menghitung distribusi, persentase, rata-rata, minimum, dan maksimum; needs_attention() mengurutkan score terendah; /api/stats mengekspos semuanya sebagai JSON untuk integrasi. Contoh output nyata:</w:t>
+        <w:t>Fitur analisis baru di atas prediksi: summary() menghitung distribusi, persentase, rata-rata, minimum, dan maksimum; needs_attention() mengurutkan score terendah; /api/stats mengekspos semuanya sebagai JSON untuk integrasi. Contoh output nyata (capture terminal):</w:t>
       </w:r>
     </w:p>
     <w:p>
       <w:pPr>
-        <w:jc w:val="left"/>
+        <w:jc w:val="center"/>
+      </w:pPr>
+      <w:r>
+        <w:drawing>
+          <wp:inline xmlns:a="http://schemas.openxmlformats.org/drawingml/2006/main" xmlns:pic="http://schemas.openxmlformats.org/drawingml/2006/picture">
+            <wp:extent cx="5486400" cy="1294134"/>
+            <wp:docPr id="5" name="Picture 5"/>
+            <wp:cNvGraphicFramePr>
+              <a:graphicFrameLocks noChangeAspect="1"/>
+            </wp:cNvGraphicFramePr>
+            <a:graphic>
+              <a:graphicData uri="http://schemas.openxmlformats.org/drawingml/2006/picture">
+                <pic:pic>
+                  <pic:nvPicPr>
+                    <pic:cNvPr id="0" name="terminal_stats.png"/>
+                    <pic:cNvPicPr/>
+                  </pic:nvPicPr>
+                  <pic:blipFill>
+                    <a:blip r:embed="rId13"/>
+                    <a:stretch>
+                      <a:fillRect/>
+                    </a:stretch>
+                  </pic:blipFill>
+                  <pic:spPr>
+                    <a:xfrm>
+                      <a:off x="0" y="0"/>
+                      <a:ext cx="5486400" cy="1294134"/>
+                    </a:xfrm>
+                    <a:prstGeom prst="rect"/>
+                  </pic:spPr>
+                </pic:pic>
+              </a:graphicData>
+            </a:graphic>
+          </wp:inline>
+        </w:drawing>
+      </w:r>
+    </w:p>
+    <w:p>
+      <w:pPr>
+        <w:jc w:val="center"/>
       </w:pPr>
       <w:r>
         <w:rPr>
@@ -1297,23 +1457,6 @@
           <w:sz w:val="22"/>
         </w:rPr>
         <w:t>Gambar 6.1 Ringkasan /api/stats (data seed).</w:t>
-      </w:r>
-    </w:p>
-    <w:p>
-      <w:pPr>
-        <w:spacing w:after="120"/>
-        <w:shd w:val="clear" w:fill="F2F2F2"/>
-      </w:pPr>
-      <w:r>
-        <w:rPr>
-          <w:rFonts w:ascii="Consolas" w:hAnsi="Consolas"/>
-          <w:sz w:val="20"/>
-        </w:rPr>
-        <w:t>{"total": 6, "high_risk": 3, "medium_risk": 0, "low_risk": 3,</w:t>
-        <w:br/>
-        <w:t xml:space="preserve"> "avg_score": 61.5, "min_score": 41.0, "max_score": 86.0,</w:t>
-        <w:br/>
-        <w:t xml:space="preserve"> "high_pct": 50.0, "medium_pct": 0.0, "low_pct": 50.0}</w:t>
       </w:r>
     </w:p>
     <w:p>
@@ -1349,12 +1492,51 @@
           <w:b w:val="0"/>
           <w:sz w:val="24"/>
         </w:rPr>
-        <w:t>Seluruh pekerjaan dilakukan di branch uts-work (aturan: jangan mengerjakan langsung di main). Riwayat commit dibuat bertahap dan deskriptif:</w:t>
+        <w:t>Seluruh pekerjaan dilakukan di branch uts-work (aturan: jangan mengerjakan langsung di main). Riwayat commit dibuat bertahap dan deskriptif (capture terminal):</w:t>
       </w:r>
     </w:p>
     <w:p>
       <w:pPr>
-        <w:jc w:val="left"/>
+        <w:jc w:val="center"/>
+      </w:pPr>
+      <w:r>
+        <w:drawing>
+          <wp:inline xmlns:a="http://schemas.openxmlformats.org/drawingml/2006/main" xmlns:pic="http://schemas.openxmlformats.org/drawingml/2006/picture">
+            <wp:extent cx="5486400" cy="3452013"/>
+            <wp:docPr id="6" name="Picture 6"/>
+            <wp:cNvGraphicFramePr>
+              <a:graphicFrameLocks noChangeAspect="1"/>
+            </wp:cNvGraphicFramePr>
+            <a:graphic>
+              <a:graphicData uri="http://schemas.openxmlformats.org/drawingml/2006/picture">
+                <pic:pic>
+                  <pic:nvPicPr>
+                    <pic:cNvPr id="0" name="terminal_git.png"/>
+                    <pic:cNvPicPr/>
+                  </pic:nvPicPr>
+                  <pic:blipFill>
+                    <a:blip r:embed="rId14"/>
+                    <a:stretch>
+                      <a:fillRect/>
+                    </a:stretch>
+                  </pic:blipFill>
+                  <pic:spPr>
+                    <a:xfrm>
+                      <a:off x="0" y="0"/>
+                      <a:ext cx="5486400" cy="3452013"/>
+                    </a:xfrm>
+                    <a:prstGeom prst="rect"/>
+                  </pic:spPr>
+                </pic:pic>
+              </a:graphicData>
+            </a:graphic>
+          </wp:inline>
+        </w:drawing>
+      </w:r>
+    </w:p>
+    <w:p>
+      <w:pPr>
+        <w:jc w:val="center"/>
       </w:pPr>
       <w:r>
         <w:rPr>
@@ -1362,32 +1544,7 @@
           <w:i/>
           <w:sz w:val="22"/>
         </w:rPr>
-        <w:t>Gambar 7.1 git log --oneline (branch uts-work).</w:t>
-      </w:r>
-    </w:p>
-    <w:p>
-      <w:pPr>
-        <w:spacing w:after="120"/>
-        <w:shd w:val="clear" w:fill="F2F2F2"/>
-      </w:pPr>
-      <w:r>
-        <w:rPr>
-          <w:rFonts w:ascii="Consolas" w:hAnsi="Consolas"/>
-          <w:sz w:val="20"/>
-        </w:rPr>
-        <w:t>2aae318 chore: tampilkan command aslinya sebelum dijalankan di cek_uts.sh</w:t>
-        <w:br/>
-        <w:t>eca3843 chore: cek_uts.sh script pemeriksaan satu perintah</w:t>
-        <w:br/>
-        <w:t>cd8c10a docs: EVIDENCE.md bukti Docker &amp; pemetaan rubrik UTS</w:t>
-        <w:br/>
-        <w:t>a8c43bd feat: dashboard analitik, filter medium+search, form add, badges &amp; flash UI</w:t>
-        <w:br/>
-        <w:t>383c5f6 feat: tambah rute add/delete, search, api/stats, health + validasi &amp; error handling</w:t>
-        <w:br/>
-        <w:t>b6760e4 refactor: StudentRepository sentralisasi akses DB</w:t>
-        <w:br/>
-        <w:t>4579c35 feat: OOP Student + prediksi 3-tier RiskService</w:t>
+        <w:t>Gambar 7.1 git branch dan git log --oneline (branch uts-work).</w:t>
       </w:r>
     </w:p>
     <w:p>
@@ -1401,12 +1558,51 @@
           <w:b w:val="0"/>
           <w:sz w:val="24"/>
         </w:rPr>
-        <w:t>Pemeriksaan satu perintah disediakan via file cek_uts.sh. Script menampilkan setiap command (diawali $) sebelum menjalankannya: git status, git branch, git log, docker compose ps, curl /health, curl /api/stats, dan cek HTTP semua route. Cara pakai di terminal Linux:</w:t>
+        <w:t>Pemeriksaan satu perintah disediakan via file cek_uts.sh. Script menampilkan setiap command (diawali $) sebelum menjalankannya: git status, git branch, git log, docker compose ps, curl /health, curl /api/stats, dan cek HTTP semua route. Cara pakai di terminal Linux (capture terminal):</w:t>
       </w:r>
     </w:p>
     <w:p>
       <w:pPr>
-        <w:jc w:val="left"/>
+        <w:jc w:val="center"/>
+      </w:pPr>
+      <w:r>
+        <w:drawing>
+          <wp:inline xmlns:a="http://schemas.openxmlformats.org/drawingml/2006/main" xmlns:pic="http://schemas.openxmlformats.org/drawingml/2006/picture">
+            <wp:extent cx="5486400" cy="2661718"/>
+            <wp:docPr id="7" name="Picture 7"/>
+            <wp:cNvGraphicFramePr>
+              <a:graphicFrameLocks noChangeAspect="1"/>
+            </wp:cNvGraphicFramePr>
+            <a:graphic>
+              <a:graphicData uri="http://schemas.openxmlformats.org/drawingml/2006/picture">
+                <pic:pic>
+                  <pic:nvPicPr>
+                    <pic:cNvPr id="0" name="terminal_cek.png"/>
+                    <pic:cNvPicPr/>
+                  </pic:nvPicPr>
+                  <pic:blipFill>
+                    <a:blip r:embed="rId15"/>
+                    <a:stretch>
+                      <a:fillRect/>
+                    </a:stretch>
+                  </pic:blipFill>
+                  <pic:spPr>
+                    <a:xfrm>
+                      <a:off x="0" y="0"/>
+                      <a:ext cx="5486400" cy="2661718"/>
+                    </a:xfrm>
+                    <a:prstGeom prst="rect"/>
+                  </pic:spPr>
+                </pic:pic>
+              </a:graphicData>
+            </a:graphic>
+          </wp:inline>
+        </w:drawing>
+      </w:r>
+    </w:p>
+    <w:p>
+      <w:pPr>
+        <w:jc w:val="center"/>
       </w:pPr>
       <w:r>
         <w:rPr>
@@ -1414,28 +1610,7 @@
           <w:i/>
           <w:sz w:val="22"/>
         </w:rPr>
-        <w:t>Perintah pemeriksaan.</w:t>
-      </w:r>
-    </w:p>
-    <w:p>
-      <w:pPr>
-        <w:spacing w:after="120"/>
-        <w:shd w:val="clear" w:fill="F2F2F2"/>
-      </w:pPr>
-      <w:r>
-        <w:rPr>
-          <w:rFonts w:ascii="Consolas" w:hAnsi="Consolas"/>
-          <w:sz w:val="20"/>
-        </w:rPr>
-        <w:t>cd /home/herdan/UTSPemrograman3</w:t>
-        <w:br/>
-        <w:t>chmod +x cek_uts.sh</w:t>
-        <w:br/>
-        <w:t>./cek_uts.sh</w:t>
-        <w:br/>
-        <w:t># opsional bila container belum jalan:</w:t>
-        <w:br/>
-        <w:t>docker compose up -d --build</w:t>
+        <w:t>Gambar 7.2 Menjalankan ./cek_uts.sh.</w:t>
       </w:r>
     </w:p>
     <w:p>
@@ -1449,7 +1624,7 @@
           <w:b w:val="0"/>
           <w:sz w:val="24"/>
         </w:rPr>
-        <w:t>Dokumen pendukung EVIDENCE.md memetakan tiap butir rubrik ke file dan command pembuktiannya. Ini memenuhi butir 4, 5, dan 13. Langkah tersisa sebelum demo: git push -u origin uts-work lalu tunjukkan aplikasi berjalan di http://localhost:8080.</w:t>
+        <w:t>Dokumen pendukung EVIDENCE.md memetakan tiap butir rubrik ke file dan command pembuktiannya. Ini memenuhi butir 4, 5, dan 13. Branch uts-work sudah di-push ke origin; tunjukkan aplikasi berjalan di http://localhost:8080 saat demo.</w:t>
       </w:r>
     </w:p>
     <w:p>

</xml_diff>

<commit_message>
docs: samakan gaya screenshot terminal dengan contoh Laporan Pertemuan 5
</commit_message>
<xml_diff>
--- a/Laporan UTS Pemrograman 3 - Student Risk Web.docx
+++ b/Laporan UTS Pemrograman 3 - Student Risk Web.docx
@@ -868,7 +868,7 @@
       <w:r>
         <w:drawing>
           <wp:inline xmlns:a="http://schemas.openxmlformats.org/drawingml/2006/main" xmlns:pic="http://schemas.openxmlformats.org/drawingml/2006/picture">
-            <wp:extent cx="5486400" cy="2299637"/>
+            <wp:extent cx="5486400" cy="2684417"/>
             <wp:docPr id="1" name="Picture 1"/>
             <wp:cNvGraphicFramePr>
               <a:graphicFrameLocks noChangeAspect="1"/>
@@ -889,7 +889,7 @@
                   <pic:spPr>
                     <a:xfrm>
                       <a:off x="0" y="0"/>
-                      <a:ext cx="5486400" cy="2299637"/>
+                      <a:ext cx="5486400" cy="2684417"/>
                     </a:xfrm>
                     <a:prstGeom prst="rect"/>
                   </pic:spPr>
@@ -956,7 +956,7 @@
       <w:r>
         <w:drawing>
           <wp:inline xmlns:a="http://schemas.openxmlformats.org/drawingml/2006/main" xmlns:pic="http://schemas.openxmlformats.org/drawingml/2006/picture">
-            <wp:extent cx="5303520" cy="2152036"/>
+            <wp:extent cx="5303520" cy="1733115"/>
             <wp:docPr id="2" name="Picture 2"/>
             <wp:cNvGraphicFramePr>
               <a:graphicFrameLocks noChangeAspect="1"/>
@@ -977,7 +977,7 @@
                   <pic:spPr>
                     <a:xfrm>
                       <a:off x="0" y="0"/>
-                      <a:ext cx="5303520" cy="2152036"/>
+                      <a:ext cx="5303520" cy="1733115"/>
                     </a:xfrm>
                     <a:prstGeom prst="rect"/>
                   </pic:spPr>
@@ -1022,7 +1022,7 @@
       <w:r>
         <w:drawing>
           <wp:inline xmlns:a="http://schemas.openxmlformats.org/drawingml/2006/main" xmlns:pic="http://schemas.openxmlformats.org/drawingml/2006/picture">
-            <wp:extent cx="5486400" cy="1380226"/>
+            <wp:extent cx="5486400" cy="1665514"/>
             <wp:docPr id="3" name="Picture 3"/>
             <wp:cNvGraphicFramePr>
               <a:graphicFrameLocks noChangeAspect="1"/>
@@ -1043,7 +1043,7 @@
                   <pic:spPr>
                     <a:xfrm>
                       <a:off x="0" y="0"/>
-                      <a:ext cx="5486400" cy="1380226"/>
+                      <a:ext cx="5486400" cy="1665514"/>
                     </a:xfrm>
                     <a:prstGeom prst="rect"/>
                   </pic:spPr>
@@ -1326,7 +1326,7 @@
       <w:r>
         <w:drawing>
           <wp:inline xmlns:a="http://schemas.openxmlformats.org/drawingml/2006/main" xmlns:pic="http://schemas.openxmlformats.org/drawingml/2006/picture">
-            <wp:extent cx="5486400" cy="1806291"/>
+            <wp:extent cx="5486400" cy="2302329"/>
             <wp:docPr id="4" name="Picture 4"/>
             <wp:cNvGraphicFramePr>
               <a:graphicFrameLocks noChangeAspect="1"/>
@@ -1347,7 +1347,7 @@
                   <pic:spPr>
                     <a:xfrm>
                       <a:off x="0" y="0"/>
-                      <a:ext cx="5486400" cy="1806291"/>
+                      <a:ext cx="5486400" cy="2302329"/>
                     </a:xfrm>
                     <a:prstGeom prst="rect"/>
                   </pic:spPr>
@@ -1414,7 +1414,7 @@
       <w:r>
         <w:drawing>
           <wp:inline xmlns:a="http://schemas.openxmlformats.org/drawingml/2006/main" xmlns:pic="http://schemas.openxmlformats.org/drawingml/2006/picture">
-            <wp:extent cx="5486400" cy="1294134"/>
+            <wp:extent cx="5486400" cy="2429691"/>
             <wp:docPr id="5" name="Picture 5"/>
             <wp:cNvGraphicFramePr>
               <a:graphicFrameLocks noChangeAspect="1"/>
@@ -1435,7 +1435,7 @@
                   <pic:spPr>
                     <a:xfrm>
                       <a:off x="0" y="0"/>
-                      <a:ext cx="5486400" cy="1294134"/>
+                      <a:ext cx="5486400" cy="2429691"/>
                     </a:xfrm>
                     <a:prstGeom prst="rect"/>
                   </pic:spPr>
@@ -1502,7 +1502,7 @@
       <w:r>
         <w:drawing>
           <wp:inline xmlns:a="http://schemas.openxmlformats.org/drawingml/2006/main" xmlns:pic="http://schemas.openxmlformats.org/drawingml/2006/picture">
-            <wp:extent cx="5486400" cy="3452013"/>
+            <wp:extent cx="5486400" cy="2302329"/>
             <wp:docPr id="6" name="Picture 6"/>
             <wp:cNvGraphicFramePr>
               <a:graphicFrameLocks noChangeAspect="1"/>
@@ -1523,7 +1523,7 @@
                   <pic:spPr>
                     <a:xfrm>
                       <a:off x="0" y="0"/>
-                      <a:ext cx="5486400" cy="3452013"/>
+                      <a:ext cx="5486400" cy="2302329"/>
                     </a:xfrm>
                     <a:prstGeom prst="rect"/>
                   </pic:spPr>
@@ -1568,7 +1568,7 @@
       <w:r>
         <w:drawing>
           <wp:inline xmlns:a="http://schemas.openxmlformats.org/drawingml/2006/main" xmlns:pic="http://schemas.openxmlformats.org/drawingml/2006/picture">
-            <wp:extent cx="5486400" cy="2661718"/>
+            <wp:extent cx="5486400" cy="6377940"/>
             <wp:docPr id="7" name="Picture 7"/>
             <wp:cNvGraphicFramePr>
               <a:graphicFrameLocks noChangeAspect="1"/>
@@ -1589,7 +1589,7 @@
                   <pic:spPr>
                     <a:xfrm>
                       <a:off x="0" y="0"/>
-                      <a:ext cx="5486400" cy="2661718"/>
+                      <a:ext cx="5486400" cy="6377940"/>
                     </a:xfrm>
                     <a:prstGeom prst="rect"/>
                   </pic:spPr>

</xml_diff>

<commit_message>
docs: font Ubuntu Mono + simpan screenshot terminal di docs/img
</commit_message>
<xml_diff>
--- a/Laporan UTS Pemrograman 3 - Student Risk Web.docx
+++ b/Laporan UTS Pemrograman 3 - Student Risk Web.docx
@@ -956,7 +956,7 @@
       <w:r>
         <w:drawing>
           <wp:inline xmlns:a="http://schemas.openxmlformats.org/drawingml/2006/main" xmlns:pic="http://schemas.openxmlformats.org/drawingml/2006/picture">
-            <wp:extent cx="5303520" cy="1733115"/>
+            <wp:extent cx="5303520" cy="1609997"/>
             <wp:docPr id="2" name="Picture 2"/>
             <wp:cNvGraphicFramePr>
               <a:graphicFrameLocks noChangeAspect="1"/>
@@ -977,7 +977,7 @@
                   <pic:spPr>
                     <a:xfrm>
                       <a:off x="0" y="0"/>
-                      <a:ext cx="5303520" cy="1733115"/>
+                      <a:ext cx="5303520" cy="1609997"/>
                     </a:xfrm>
                     <a:prstGeom prst="rect"/>
                   </pic:spPr>
@@ -1414,7 +1414,7 @@
       <w:r>
         <w:drawing>
           <wp:inline xmlns:a="http://schemas.openxmlformats.org/drawingml/2006/main" xmlns:pic="http://schemas.openxmlformats.org/drawingml/2006/picture">
-            <wp:extent cx="5486400" cy="2429691"/>
+            <wp:extent cx="5486400" cy="2302329"/>
             <wp:docPr id="5" name="Picture 5"/>
             <wp:cNvGraphicFramePr>
               <a:graphicFrameLocks noChangeAspect="1"/>
@@ -1435,7 +1435,7 @@
                   <pic:spPr>
                     <a:xfrm>
                       <a:off x="0" y="0"/>
-                      <a:ext cx="5486400" cy="2429691"/>
+                      <a:ext cx="5486400" cy="2302329"/>
                     </a:xfrm>
                     <a:prstGeom prst="rect"/>
                   </pic:spPr>
@@ -1568,7 +1568,7 @@
       <w:r>
         <w:drawing>
           <wp:inline xmlns:a="http://schemas.openxmlformats.org/drawingml/2006/main" xmlns:pic="http://schemas.openxmlformats.org/drawingml/2006/picture">
-            <wp:extent cx="5486400" cy="6377940"/>
+            <wp:extent cx="5486400" cy="6250577"/>
             <wp:docPr id="7" name="Picture 7"/>
             <wp:cNvGraphicFramePr>
               <a:graphicFrameLocks noChangeAspect="1"/>
@@ -1589,7 +1589,7 @@
                   <pic:spPr>
                     <a:xfrm>
                       <a:off x="0" y="0"/>
-                      <a:ext cx="5486400" cy="6377940"/>
+                      <a:ext cx="5486400" cy="6250577"/>
                     </a:xfrm>
                     <a:prstGeom prst="rect"/>
                   </pic:spPr>

</xml_diff>